<commit_message>
writing/v2: the regeneration, REP02 and SCL03 results were lost with the sandbox (NEXT-SESSION §10) — say so
Co-Authored-By: Claude Fable 5 <noreply@anthropic.com>
</commit_message>
<xml_diff>
--- a/writing/v2/Digital-Minds-Sprint-Submission-v2.docx
+++ b/writing/v2/Digital-Minds-Sprint-Submission-v2.docx
@@ -792,7 +792,7 @@
         <w:rPr>
           <w:sz w:val="20"/>
         </w:rPr>
-        <w:t>: scorers, a 108-quantity reproduction script, the released adapters (44 files at the time of writing; Appendix Q says which), the two-axis screen with placebo selection, and a corrected map that regenerated from source on a second machine.</w:t>
+        <w:t>: scorers, a 108-quantity reproduction script, the released adapters (44 files; Appendix Q says which, and what was lost), the two-axis screen with placebo selection, and a corrected map that regenerated from source on a second machine.</w:t>
       </w:r>
     </w:p>
     <w:p>
@@ -3700,7 +3700,7 @@
         <w:rPr>
           <w:sz w:val="20"/>
         </w:rPr>
-        <w:t xml:space="preserve"> One environment (a 5×5 grid under a single-step bandit; a second, non-spatial world failed its build gate because a documented policy anchor was never wired — Appendix M) and one model family; only 4B had an Instruct release, so five ladder sizes substitute base models with a different chat template, filtered by the per-size gate. The functional state is reward-driven avoidance; the only cost-paying instrument is an exploratory willingness-to-pay that orders the untrained base as most averse (a template prior), though it does fire under instruction. ORG-B's "no state" is verified by an in-domain behavioural read, which our own rule forbids for instruments — an axiom, and the ratio band is coarse (±4 states of 128) and blind to constant-move policies, which is why move entropy is reported beside it. Contingency is bimodal at n = 8–12; the two non-degenerate single-seed successes are one seed each and were not re-derived at the text level (NAR01 stored three generations per row); the bootstrap under-covers; and on the untrained model every out-of-domain read takes exactly two values across twelve seeds (glyph assignment flips with parity), so the residual baseline has one degree of freedom. Reward magnitude does not grade the organism (E11), so the map is a binary contrast. The narration-positive group is essentially ORG-C, which differs on both axes. Pool truncation always takes the first N sentences. Provenance was imperfect: the E16 scorer postdates its run by three days (the docstring pre-commitments predate it by 16 minutes), the first-round pass rule appeared in no committed code, and the regeneration and REP02 results of Appendix P–Q were read on the compute host and had not been mirrored into the repository when this was written.</w:t>
+        <w:t xml:space="preserve"> One environment (a 5×5 grid under a single-step bandit; a second, non-spatial world failed its build gate because a documented policy anchor was never wired — Appendix M) and one model family; only 4B had an Instruct release, so five ladder sizes substitute base models with a different chat template, filtered by the per-size gate. The functional state is reward-driven avoidance; the only cost-paying instrument is an exploratory willingness-to-pay that orders the untrained base as most averse (a template prior), though it does fire under instruction. ORG-B's "no state" is verified by an in-domain behavioural read, which our own rule forbids for instruments — an axiom, and the ratio band is coarse (±4 states of 128) and blind to constant-move policies, which is why move entropy is reported beside it. Contingency is bimodal at n = 8–12; the two non-degenerate single-seed successes are one seed each and were not re-derived at the text level (NAR01 stored three generations per row); the bootstrap under-covers; and on the untrained model every out-of-domain read takes exactly two values across twelve seeds (glyph assignment flips with parity), so the residual baseline has one degree of freedom. Reward magnitude does not grade the organism (E11), so the map is a binary contrast. The narration-positive group is essentially ORG-C, which differs on both axes. Pool truncation always takes the first N sentences. Provenance was imperfect: the E16 scorer postdates its run by three days (the docstring pre-commitments predate it by 16 minutes), the first-round pass rule appeared in no committed code, and the regeneration and REP02 results of Appendix P–Q were read and scored on the compute host, which was then lost (HTTP 410) before their JSONs were pulled — what remains is the recorded scorer output.</w:t>
       </w:r>
     </w:p>
     <w:p>
@@ -3925,7 +3925,7 @@
         <w:rPr>
           <w:sz w:val="20"/>
         </w:rPr>
-        <w:t xml:space="preserve"> holds 44 files (Appendix Q); the regenerated E16 v2 set is being mirrored.</w:t>
+        <w:t xml:space="preserve"> holds 44 files (Appendix Q); the regenerated E16 v2 set was lost with its sandbox before it could be mirrored.</w:t>
       </w:r>
     </w:p>
     <w:p>
@@ -57545,7 +57545,7 @@
         <w:rPr>
           <w:sz w:val="20"/>
         </w:rPr>
-        <w:t xml:space="preserve"> re-pins the residual at one absolute column on every decoding step, which holds the roundtrip identity on the six-token unit-test stub and corrupts generation on the 36-layer model at 16 tokens with a real chat template. Fixes on file: re-capture per step, or intervene on the prefill only and let the KV cache carry it (the option the docstring rejected on purity grounds without validating at scale); extend the test to 16 tokens on a deeper stub before re-running (~25 GPU-min). The results file was read on the compute host and had not been mirrored into the repository when this was written; the pre-registration did what it exists to do — a broken harness was caught before it could become a published null.</w:t>
+        <w:t xml:space="preserve"> re-pins the residual at one absolute column on every decoding step, which holds the roundtrip identity on the six-token unit-test stub and corrupts generation on the 36-layer model at 16 tokens with a real chat template. Fixes on file: re-capture per step, or intervene on the prefill only and let the KV cache carry it (the option the docstring rejected on purity grounds without validating at scale); extend the test to 16 tokens on a deeper stub before re-running (~25 GPU-min). The results file was lost with the compute host before it was pulled; the pre-registration did what it exists to do — a broken harness was caught before it could become a published null.</w:t>
       </w:r>
     </w:p>
     <w:p>
@@ -57626,7 +57626,7 @@
         <w:rPr>
           <w:sz w:val="20"/>
         </w:rPr>
-        <w:t xml:space="preserve"> files: E16 v2 ORG-A seeds 0–7, one E16 shard, and SCL01's 0.6B and 1.7B sizes (0.6B failed its build gate; archive value, not science). The previous version of this report said "~370 organisms"; that sentence was not backed by artifacts. Most archives were lost with two ephemeral sandboxes (2026-08-16); NAR-track adapters (48 for NAR02, 32/64 for NAR01a folded, the rest per-shard) were left on sandbox volumes and are recoverable only where those volumes survive. On 2026-08-17 the E16 v2 map was regenerated from source on a fresh compute host (below), which restores its 60 trained adapters there; mirroring them to the repository is pending (~1 min/MB over the channel used). Anything recovered can be verified against the committed hashes.</w:t>
+        <w:t xml:space="preserve"> files: E16 v2 ORG-A seeds 0–7, one E16 shard, and SCL01's 0.6B and 1.7B sizes (0.6B failed its build gate; archive value, not science). The previous version of this report said "~370 organisms"; that sentence was not backed by artifacts. Most archives were lost with two ephemeral sandboxes (2026-08-16); NAR-track adapters (48 for NAR02, 32/64 for NAR01a folded, the rest per-shard) were left on sandbox volumes and are recoverable only where those volumes survive. On 2026-08-17 the E16 v2 map was regenerated from source on a fresh compute host (below), which restored its 60 trained adapters there — and that host was then lost (HTTP 410, the programme's second such loss) before either the adapters or the results JSON had been pulled; molab boxes do not share a volume, so there is no salvage path. Anything recovered in future can be verified against the committed hashes; the standing rule is now to pull the results JSON the moment a run finishes.</w:t>
       </w:r>
     </w:p>
     <w:p>
@@ -57697,7 +57697,7 @@
         <w:rPr>
           <w:sz w:val="20"/>
         </w:rPr>
-        <w:t>) had not been mirrored into the repository when this was written, so this paragraph rests on the recorded scorer output rather than on a committed file; the same per-cell seeding that made E18's control reproduce E16 v1's wrecked cells bit-for-bit 13 days later, and ORG-D bit-identical across E16, E17 and every NAR arm, is what makes the regeneration possible.</w:t>
+        <w:t>) was lost with the host before it was pulled, so this paragraph rests on the recorded scorer output rather than on a committed file — the reproduction was established and then discarded, which is exactly the failure the pull-immediately rule now guards against; the same per-cell seeding that made E18's control reproduce E16 v1's wrecked cells bit-for-bit 13 days later, and ORG-D bit-identical across E16, E17 and every NAR arm, is what makes the regeneration possible.</w:t>
       </w:r>
     </w:p>
     <w:p>
@@ -57710,7 +57710,7 @@
           <w:b/>
           <w:sz w:val="20"/>
         </w:rPr>
-        <w:t>In flight, not reported.</w:t>
+        <w:t>Lost mid-run, not reported.</w:t>
       </w:r>
       <w:r>
         <w:rPr>
@@ -57742,7 +57742,7 @@
         <w:rPr>
           <w:sz w:val="20"/>
         </w:rPr>
-        <w:t>; probe layer 38; sequential), was running when this report was written. It has a committed run script and scorer but no pre-commitment docstring of its own — it is E16's pre-registration executed at another size — and it is not quoted here.</w:t>
+        <w:t>; probe layer 38; sequential), had produced ~38 of 72 rows and 31 adapters when the same host was lost. It has a committed run script and scorer but no pre-commitment docstring of its own — it is E16's pre-registration executed at another size — and nothing from it is quoted here.</w:t>
       </w:r>
     </w:p>
     <w:p>

</xml_diff>